<commit_message>
chore(plantillas): actualizar plantillas de programación académica
</commit_message>
<xml_diff>
--- a/backend/storage/app/plantillas/plantilla-pa-anexo.docx
+++ b/backend/storage/app/plantillas/plantilla-pa-anexo.docx
@@ -1,6 +1,6 @@
 
 <file path=word/document.xml><?xml version="1.0" encoding="utf-8"?>
-<w:document xmlns:wpc="http://schemas.microsoft.com/office/word/2010/wordprocessingCanvas" xmlns:cx="http://schemas.microsoft.com/office/drawing/2014/chartex" xmlns:mc="http://schemas.openxmlformats.org/markup-compatibility/2006" xmlns:o="urn:schemas-microsoft-com:office:office" xmlns:r="http://schemas.openxmlformats.org/officeDocument/2006/relationships" xmlns:m="http://schemas.openxmlformats.org/officeDocument/2006/math" xmlns:v="urn:schemas-microsoft-com:vml" xmlns:wp14="http://schemas.microsoft.com/office/word/2010/wordprocessingDrawing" xmlns:wp="http://schemas.openxmlformats.org/drawingml/2006/wordprocessingDrawing" xmlns:w10="urn:schemas-microsoft-com:office:word" xmlns:w="http://schemas.openxmlformats.org/wordprocessingml/2006/main" xmlns:w14="http://schemas.microsoft.com/office/word/2010/wordml" xmlns:w15="http://schemas.microsoft.com/office/word/2012/wordml" xmlns:w16se="http://schemas.microsoft.com/office/word/2015/wordml/symex" xmlns:wpg="http://schemas.microsoft.com/office/word/2010/wordprocessingGroup" xmlns:wpi="http://schemas.microsoft.com/office/word/2010/wordprocessingInk" xmlns:wne="http://schemas.microsoft.com/office/word/2006/wordml" xmlns:wps="http://schemas.microsoft.com/office/word/2010/wordprocessingShape" mc:Ignorable="w14 w15 w16se wp14">
+<w:document xmlns:wpc="http://schemas.microsoft.com/office/word/2010/wordprocessingCanvas" xmlns:cx="http://schemas.microsoft.com/office/drawing/2014/chartex" xmlns:cx1="http://schemas.microsoft.com/office/drawing/2015/9/8/chartex" xmlns:cx2="http://schemas.microsoft.com/office/drawing/2015/10/21/chartex" xmlns:cx3="http://schemas.microsoft.com/office/drawing/2016/5/9/chartex" xmlns:cx4="http://schemas.microsoft.com/office/drawing/2016/5/10/chartex" xmlns:cx5="http://schemas.microsoft.com/office/drawing/2016/5/11/chartex" xmlns:cx6="http://schemas.microsoft.com/office/drawing/2016/5/12/chartex" xmlns:cx7="http://schemas.microsoft.com/office/drawing/2016/5/13/chartex" xmlns:cx8="http://schemas.microsoft.com/office/drawing/2016/5/14/chartex" xmlns:mc="http://schemas.openxmlformats.org/markup-compatibility/2006" xmlns:aink="http://schemas.microsoft.com/office/drawing/2016/ink" xmlns:am3d="http://schemas.microsoft.com/office/drawing/2017/model3d" xmlns:o="urn:schemas-microsoft-com:office:office" xmlns:oel="http://schemas.microsoft.com/office/2019/extlst" xmlns:r="http://schemas.openxmlformats.org/officeDocument/2006/relationships" xmlns:m="http://schemas.openxmlformats.org/officeDocument/2006/math" xmlns:v="urn:schemas-microsoft-com:vml" xmlns:wp14="http://schemas.microsoft.com/office/word/2010/wordprocessingDrawing" xmlns:wp="http://schemas.openxmlformats.org/drawingml/2006/wordprocessingDrawing" xmlns:w10="urn:schemas-microsoft-com:office:word" xmlns:w="http://schemas.openxmlformats.org/wordprocessingml/2006/main" xmlns:w14="http://schemas.microsoft.com/office/word/2010/wordml" xmlns:w15="http://schemas.microsoft.com/office/word/2012/wordml" xmlns:w16cex="http://schemas.microsoft.com/office/word/2018/wordml/cex" xmlns:w16cid="http://schemas.microsoft.com/office/word/2016/wordml/cid" xmlns:w16="http://schemas.microsoft.com/office/word/2018/wordml" xmlns:w16du="http://schemas.microsoft.com/office/word/2023/wordml/word16du" xmlns:w16sdtdh="http://schemas.microsoft.com/office/word/2020/wordml/sdtdatahash" xmlns:w16sdtfl="http://schemas.microsoft.com/office/word/2024/wordml/sdtformatlock" xmlns:w16se="http://schemas.microsoft.com/office/word/2015/wordml/symex" xmlns:wpg="http://schemas.microsoft.com/office/word/2010/wordprocessingGroup" xmlns:wpi="http://schemas.microsoft.com/office/word/2010/wordprocessingInk" xmlns:wne="http://schemas.microsoft.com/office/word/2006/wordml" xmlns:wps="http://schemas.microsoft.com/office/word/2010/wordprocessingShape" mc:Ignorable="w14 w15 w16se w16cid w16 w16cex w16sdtdh w16sdtfl w16du wp14">
   <w:body>
     <w:p>
       <w:pPr>
@@ -31,7 +31,7 @@
         <mc:AlternateContent>
           <mc:Choice Requires="wps">
             <w:drawing>
-              <wp:anchor distT="0" distB="0" distL="114300" distR="114300" simplePos="0" relativeHeight="251712512" behindDoc="0" locked="0" layoutInCell="1" allowOverlap="1" wp14:anchorId="3363D55A" wp14:editId="17FCA122">
+              <wp:anchor distT="0" distB="0" distL="114300" distR="114300" simplePos="0" relativeHeight="251656704" behindDoc="0" locked="0" layoutInCell="1" allowOverlap="1" wp14:anchorId="3363D55A" wp14:editId="17FCA122">
                 <wp:simplePos x="0" y="0"/>
                 <wp:positionH relativeFrom="column">
                   <wp:posOffset>745693</wp:posOffset>
@@ -108,7 +108,7 @@
           <w:szCs w:val="32"/>
           <w:lang w:val="es-ES" w:eastAsia="es-ES"/>
         </w:rPr>
-        <w:object w:dxaOrig="1440" w:dyaOrig="1440">
+        <w:object w:dxaOrig="1440" w:dyaOrig="1440" w14:anchorId="7C637708">
           <v:shapetype id="_x0000_t75" coordsize="21600,21600" o:spt="75" o:preferrelative="t" path="m@4@5l@4@11@9@11@9@5xe" filled="f" stroked="f">
             <v:stroke joinstyle="miter"/>
             <v:formulas>
@@ -128,10 +128,10 @@
             <v:path o:extrusionok="f" gradientshapeok="t" o:connecttype="rect"/>
             <o:lock v:ext="edit" aspectratio="t"/>
           </v:shapetype>
-          <v:shape id="_x0000_s1026" type="#_x0000_t75" style="position:absolute;left:0;text-align:left;margin-left:-5.4pt;margin-top:-15.25pt;width:67.8pt;height:64.95pt;z-index:-251600896;mso-position-horizontal-relative:text;mso-position-vertical-relative:text">
+          <v:shape id="_x0000_s2050" type="#_x0000_t75" style="position:absolute;left:0;text-align:left;margin-left:-5.4pt;margin-top:-15.25pt;width:67.8pt;height:64.95pt;z-index:-251656704;mso-position-horizontal-relative:text;mso-position-vertical-relative:text">
             <v:imagedata r:id="rId7" o:title=""/>
           </v:shape>
-          <o:OLEObject Type="Embed" ProgID="MSPhotoEd.3" ShapeID="_x0000_s1026" DrawAspect="Content" ObjectID="_1835865687" r:id="rId8"/>
+          <o:OLEObject Type="Embed" ProgID="MSPhotoEd.3" ShapeID="_x0000_s2050" DrawAspect="Content" ObjectID="_1840257993" r:id="rId8"/>
         </w:object>
       </w:r>
       <w:r>
@@ -149,7 +149,7 @@
           </w14:shadow>
         </w:rPr>
         <w:drawing>
-          <wp:anchor distT="0" distB="0" distL="114300" distR="114300" simplePos="0" relativeHeight="251714560" behindDoc="0" locked="0" layoutInCell="1" allowOverlap="1" wp14:anchorId="51BE5B1C" wp14:editId="0EBA1F23">
+          <wp:anchor distT="0" distB="0" distL="114300" distR="114300" simplePos="0" relativeHeight="251658752" behindDoc="0" locked="0" layoutInCell="1" allowOverlap="1" wp14:anchorId="51BE5B1C" wp14:editId="0EBA1F23">
             <wp:simplePos x="0" y="0"/>
             <wp:positionH relativeFrom="column">
               <wp:posOffset>5521649</wp:posOffset>
@@ -211,7 +211,6 @@
           </wp:anchor>
         </w:drawing>
       </w:r>
-      <w:proofErr w:type="gramStart"/>
       <w:r>
         <w:rPr>
           <w:rFonts w:ascii="Arial" w:eastAsia="MS Mincho" w:hAnsi="Arial" w:cs="Arial"/>
@@ -224,22 +223,7 @@
             </w14:srgbClr>
           </w14:shadow>
         </w:rPr>
-        <w:t>UNIVERSIDAD  NACIONAL</w:t>
-      </w:r>
-      <w:proofErr w:type="gramEnd"/>
-      <w:r>
-        <w:rPr>
-          <w:rFonts w:ascii="Arial" w:eastAsia="MS Mincho" w:hAnsi="Arial" w:cs="Arial"/>
-          <w:b/>
-          <w:sz w:val="26"/>
-          <w:szCs w:val="26"/>
-          <w14:shadow w14:blurRad="50800" w14:dist="38100" w14:dir="2700000" w14:sx="100000" w14:sy="100000" w14:kx="0" w14:ky="0" w14:algn="tl">
-            <w14:srgbClr w14:val="000000">
-              <w14:alpha w14:val="60000"/>
-            </w14:srgbClr>
-          </w14:shadow>
-        </w:rPr>
-        <w:t xml:space="preserve">  DE  PIURA</w:t>
+        <w:t>UNIVERSIDAD  NACIONAL  DE  PIURA</w:t>
       </w:r>
     </w:p>
     <w:p>
@@ -315,7 +299,7 @@
         <mc:AlternateContent>
           <mc:Choice Requires="wps">
             <w:drawing>
-              <wp:anchor distT="0" distB="0" distL="114300" distR="114300" simplePos="0" relativeHeight="251713536" behindDoc="0" locked="0" layoutInCell="1" allowOverlap="1" wp14:anchorId="15492CA7" wp14:editId="3342B938">
+              <wp:anchor distT="0" distB="0" distL="114300" distR="114300" simplePos="0" relativeHeight="251657728" behindDoc="0" locked="0" layoutInCell="1" allowOverlap="1" wp14:anchorId="15492CA7" wp14:editId="3342B938">
                 <wp:simplePos x="0" y="0"/>
                 <wp:positionH relativeFrom="column">
                   <wp:posOffset>750138</wp:posOffset>
@@ -442,7 +426,7 @@
           <w:rFonts w:ascii="Times New Roman" w:hAnsi="Times New Roman"/>
           <w:sz w:val="24"/>
         </w:rPr>
-        <w:t xml:space="preserve">"${ANIO_LEMA}"</w:t>
+        <w:t>"${ANIO_LEMA}"</w:t>
       </w:r>
     </w:p>
     <w:p>
@@ -469,7 +453,7 @@
           <w:rFonts w:ascii="Times New Roman" w:hAnsi="Times New Roman"/>
           <w:sz w:val="24"/>
         </w:rPr>
-        <w:t xml:space="preserve">${CIUDAD_FECHA}</w:t>
+        <w:t>${CIUDAD_FECHA}</w:t>
       </w:r>
     </w:p>
     <w:p>
@@ -492,19 +476,32 @@
         </w:rPr>
       </w:pPr>
       <w:r>
+        <w:t>${NUMERO_OFICIO}</w:t>
+      </w:r>
+    </w:p>
+    <w:p>
+      <w:pPr>
+        <w:rPr>
+          <w:lang w:val="es-ES" w:eastAsia="es-ES"/>
+        </w:rPr>
+      </w:pPr>
+    </w:p>
+    <w:p>
+      <w:pPr>
+        <w:spacing w:after="34"/>
+        <w:ind w:right="-15"/>
+        <w:rPr>
+          <w:rFonts w:eastAsia="Arial" w:cstheme="minorHAnsi"/>
+          <w:i/>
+        </w:rPr>
+      </w:pPr>
+      <w:r>
         <w:rPr>
           <w:rFonts w:ascii="Times New Roman" w:hAnsi="Times New Roman"/>
           <w:sz w:val="24"/>
         </w:rPr>
-        <w:t xml:space="preserve">${NUMERO_OFICIO}</w:t>
-      </w:r>
-    </w:p>
-    <w:p>
-      <w:pPr>
-        <w:rPr>
-          <w:lang w:val="es-ES" w:eastAsia="es-ES"/>
-        </w:rPr>
-      </w:pPr>
+        <w:t>${TITULO_DIRECTOR}</w:t>
+      </w:r>
     </w:p>
     <w:p>
       <w:pPr>
@@ -512,6 +509,26 @@
         <w:ind w:right="-15"/>
         <w:rPr>
           <w:rFonts w:eastAsia="Arial" w:cstheme="minorHAnsi"/>
+          <w:b/>
+          <w:i/>
+        </w:rPr>
+      </w:pPr>
+      <w:r>
+        <w:rPr>
+          <w:rFonts w:ascii="Times New Roman" w:hAnsi="Times New Roman"/>
+          <w:b/>
+          <w:bCs/>
+          <w:sz w:val="24"/>
+        </w:rPr>
+        <w:t>${NOMBRE_DIRECTOR}</w:t>
+      </w:r>
+    </w:p>
+    <w:p>
+      <w:pPr>
+        <w:spacing w:after="34"/>
+        <w:ind w:right="-15"/>
+        <w:rPr>
+          <w:rFonts w:eastAsia="Arial" w:cstheme="minorHAnsi"/>
           <w:i/>
         </w:rPr>
       </w:pPr>
@@ -520,16 +537,76 @@
           <w:rFonts w:ascii="Times New Roman" w:hAnsi="Times New Roman"/>
           <w:sz w:val="24"/>
         </w:rPr>
-        <w:t xml:space="preserve">${TITULO_DIRECTOR}</w:t>
-      </w:r>
-    </w:p>
-    <w:p>
-      <w:pPr>
-        <w:spacing w:after="34"/>
-        <w:ind w:right="-15"/>
-        <w:rPr>
-          <w:rFonts w:eastAsia="Arial" w:cstheme="minorHAnsi"/>
+        <w:t>${CARGO_DIRECTOR}</w:t>
+      </w:r>
+    </w:p>
+    <w:p>
+      <w:pPr>
+        <w:jc w:val="both"/>
+        <w:rPr>
+          <w:rFonts w:cs="Arial"/>
           <w:b/>
+          <w:bCs/>
+          <w:i/>
+        </w:rPr>
+      </w:pPr>
+      <w:r>
+        <w:rPr>
+          <w:rFonts w:cs="Arial"/>
+          <w:b/>
+          <w:bCs/>
+          <w:i/>
+        </w:rPr>
+        <w:t>Presente.-</w:t>
+      </w:r>
+    </w:p>
+    <w:p>
+      <w:pPr>
+        <w:ind w:left="2124" w:firstLine="708"/>
+        <w:jc w:val="both"/>
+        <w:rPr>
+          <w:rFonts w:cs="Arial"/>
+          <w:b/>
+          <w:i/>
+        </w:rPr>
+      </w:pPr>
+    </w:p>
+    <w:p>
+      <w:pPr>
+        <w:ind w:left="2124" w:firstLine="708"/>
+        <w:jc w:val="both"/>
+        <w:rPr>
+          <w:rFonts w:cs="Arial"/>
+          <w:b/>
+          <w:i/>
+        </w:rPr>
+      </w:pPr>
+      <w:r>
+        <w:rPr>
+          <w:rFonts w:ascii="Times New Roman" w:hAnsi="Times New Roman"/>
+          <w:b/>
+          <w:bCs/>
+          <w:sz w:val="24"/>
+        </w:rPr>
+        <w:t>ASUNTO: ASIGNACIÓN DE DOCENTE PROGRAMACIÓN ACADÉMICA ${SEMESTRE}.</w:t>
+      </w:r>
+    </w:p>
+    <w:p>
+      <w:pPr>
+        <w:ind w:firstLine="1701"/>
+        <w:jc w:val="both"/>
+        <w:rPr>
+          <w:rFonts w:cs="Arial"/>
+          <w:i/>
+        </w:rPr>
+      </w:pPr>
+    </w:p>
+    <w:p>
+      <w:pPr>
+        <w:ind w:firstLine="1701"/>
+        <w:jc w:val="both"/>
+        <w:rPr>
+          <w:rFonts w:cs="Arial"/>
           <w:i/>
         </w:rPr>
       </w:pPr>
@@ -537,18 +614,16 @@
         <w:rPr>
           <w:rFonts w:ascii="Times New Roman" w:hAnsi="Times New Roman"/>
           <w:sz w:val="24"/>
-          <w:b/>
-          <w:bCs/>
-        </w:rPr>
-        <w:t xml:space="preserve">${NOMBRE_DIRECTOR}</w:t>
-      </w:r>
-    </w:p>
-    <w:p>
-      <w:pPr>
-        <w:spacing w:after="34"/>
-        <w:ind w:right="-15"/>
-        <w:rPr>
-          <w:rFonts w:eastAsia="Arial" w:cstheme="minorHAnsi"/>
+        </w:rPr>
+        <w:t>Tengo a bien dirigirme a usted, para saludar y hacer llegar anexo al documento, la relación de los cursos de la Programación Académica que serán dictados por su Departamento Académico en el semestre académico ${SEMESTRE}.</w:t>
+      </w:r>
+    </w:p>
+    <w:p>
+      <w:pPr>
+        <w:ind w:firstLine="1701"/>
+        <w:jc w:val="both"/>
+        <w:rPr>
+          <w:rFonts w:cs="Arial"/>
           <w:i/>
         </w:rPr>
       </w:pPr>
@@ -557,104 +632,7 @@
           <w:rFonts w:ascii="Times New Roman" w:hAnsi="Times New Roman"/>
           <w:sz w:val="24"/>
         </w:rPr>
-        <w:t xml:space="preserve">${CARGO_DIRECTOR}</w:t>
-      </w:r>
-    </w:p>
-    <w:p>
-      <w:pPr>
-        <w:jc w:val="both"/>
-        <w:rPr>
-          <w:rFonts w:cs="Arial"/>
-          <w:b/>
-          <w:bCs/>
-          <w:i/>
-        </w:rPr>
-      </w:pPr>
-      <w:proofErr w:type="gramStart"/>
-      <w:r>
-        <w:rPr>
-          <w:rFonts w:cs="Arial"/>
-          <w:b/>
-          <w:bCs/>
-          <w:i/>
-        </w:rPr>
-        <w:t>Presente.-</w:t>
-      </w:r>
-      <w:proofErr w:type="gramEnd"/>
-    </w:p>
-    <w:p>
-      <w:pPr>
-        <w:ind w:left="2124" w:firstLine="708"/>
-        <w:jc w:val="both"/>
-        <w:rPr>
-          <w:rFonts w:cs="Arial"/>
-          <w:b/>
-          <w:i/>
-        </w:rPr>
-      </w:pPr>
-    </w:p>
-    <w:p>
-      <w:pPr>
-        <w:ind w:left="2124" w:firstLine="708"/>
-        <w:jc w:val="both"/>
-        <w:rPr>
-          <w:rFonts w:cs="Arial"/>
-          <w:b/>
-          <w:i/>
-        </w:rPr>
-      </w:pPr>
-      <w:r>
-        <w:rPr>
-          <w:rFonts w:ascii="Times New Roman" w:hAnsi="Times New Roman"/>
-          <w:sz w:val="24"/>
-          <w:b/>
-          <w:bCs/>
-        </w:rPr>
-        <w:t xml:space="preserve">ASUNTO: ASIGNACIÓN DE DOCENTE PROGRAMACIÓN ACADÉMICA ${SEMESTRE}.</w:t>
-      </w:r>
-    </w:p>
-    <w:p>
-      <w:pPr>
-        <w:ind w:firstLine="1701"/>
-        <w:jc w:val="both"/>
-        <w:rPr>
-          <w:rFonts w:cs="Arial"/>
-          <w:i/>
-        </w:rPr>
-      </w:pPr>
-    </w:p>
-    <w:p>
-      <w:pPr>
-        <w:ind w:firstLine="1701"/>
-        <w:jc w:val="both"/>
-        <w:rPr>
-          <w:rFonts w:cs="Arial"/>
-          <w:i/>
-        </w:rPr>
-      </w:pPr>
-      <w:r>
-        <w:rPr>
-          <w:rFonts w:ascii="Times New Roman" w:hAnsi="Times New Roman"/>
-          <w:sz w:val="24"/>
-        </w:rPr>
-        <w:t xml:space="preserve">Tengo a bien dirigirme a usted, para saludar y hacer llegar anexo al documento, la relación de los cursos de la Programación Académica que serán dictados por su Departamento Académico en el semestre académico ${SEMESTRE}.</w:t>
-      </w:r>
-    </w:p>
-    <w:p>
-      <w:pPr>
-        <w:ind w:firstLine="1701"/>
-        <w:jc w:val="both"/>
-        <w:rPr>
-          <w:rFonts w:cs="Arial"/>
-          <w:i/>
-        </w:rPr>
-      </w:pPr>
-      <w:r>
-        <w:rPr>
-          <w:rFonts w:ascii="Times New Roman" w:hAnsi="Times New Roman"/>
-          <w:sz w:val="24"/>
-        </w:rPr>
-        <w:t xml:space="preserve">Agradecería a usted se sirva alcanzarnos, el nombre del docente que tendrán a cargo el dictado de los cursos en el semestre académico ${SEMESTRE}.</w:t>
+        <w:t>Agradecería a usted se sirva alcanzarnos, el nombre del docente que tendrán a cargo el dictado de los cursos en el semestre académico ${SEMESTRE}.</w:t>
       </w:r>
     </w:p>
     <w:p>
@@ -810,7 +788,7 @@
         <mc:AlternateContent>
           <mc:Choice Requires="wpg">
             <w:drawing>
-              <wp:anchor distT="0" distB="0" distL="114300" distR="114300" simplePos="0" relativeHeight="251681792" behindDoc="0" locked="0" layoutInCell="1" allowOverlap="1" wp14:anchorId="28BC3784" wp14:editId="57AA9839">
+              <wp:anchor distT="0" distB="0" distL="114300" distR="114300" simplePos="0" relativeHeight="251655680" behindDoc="0" locked="0" layoutInCell="1" allowOverlap="1" wp14:anchorId="28BC3784" wp14:editId="57AA9839">
                 <wp:simplePos x="0" y="0"/>
                 <wp:positionH relativeFrom="column">
                   <wp:posOffset>2415540</wp:posOffset>
@@ -870,25 +848,7 @@
                                   <w:b/>
                                   <w:i/>
                                 </w:rPr>
-                                <w:t xml:space="preserve">${SECRETARIO_TITULO_NOMBRE}</w:t>
-                              </w:r>
-                              <w:proofErr w:type="spellStart"/>
-                              <w:r>
-                                <w:rPr>
-                                  <w:rFonts w:cstheme="minorHAnsi"/>
-                                  <w:b/>
-                                  <w:i/>
-                                </w:rPr>
-                                <w:t/>
-                              </w:r>
-                              <w:proofErr w:type="spellEnd"/>
-                              <w:r>
-                                <w:rPr>
-                                  <w:rFonts w:cstheme="minorHAnsi"/>
-                                  <w:b/>
-                                  <w:i/>
-                                </w:rPr>
-                                <w:t xml:space="preserve"/>
+                                <w:t>${SECRETARIO_TITULO_NOMBRE}</w:t>
                               </w:r>
                             </w:p>
                             <w:p>
@@ -1106,23 +1066,13 @@
           <w:sz w:val="20"/>
         </w:rPr>
       </w:pPr>
-      <w:proofErr w:type="spellStart"/>
       <w:r>
         <w:rPr>
           <w:rFonts w:cs="Arial"/>
           <w:i/>
           <w:sz w:val="20"/>
         </w:rPr>
-        <w:t>Dist</w:t>
-      </w:r>
-      <w:proofErr w:type="spellEnd"/>
-      <w:r>
-        <w:rPr>
-          <w:rFonts w:cs="Arial"/>
-          <w:i/>
-          <w:sz w:val="20"/>
-        </w:rPr>
-        <w:t>.</w:t>
+        <w:t>Dist.</w:t>
       </w:r>
       <w:r>
         <w:rPr>
@@ -1227,11 +1177,11 @@
       <w:r>
         <w:rPr>
           <w:rFonts w:ascii="Times New Roman" w:hAnsi="Times New Roman"/>
-          <w:sz w:val="24"/>
           <w:b/>
           <w:bCs/>
-        </w:rPr>
-        <w:t xml:space="preserve">PROGRAMACIÓN ACADÉMICA ${SEMESTRE}</w:t>
+          <w:sz w:val="24"/>
+        </w:rPr>
+        <w:t>PROGRAMACIÓN ACADÉMICA ${SEMESTRE}</w:t>
       </w:r>
     </w:p>
     <w:p>
@@ -1250,29 +1200,28 @@
       <w:r>
         <w:rPr>
           <w:rFonts w:ascii="Times New Roman" w:hAnsi="Times New Roman"/>
-          <w:sz w:val="24"/>
           <w:b/>
           <w:bCs/>
-        </w:rPr>
-        <w:t xml:space="preserve">ÁREA DE ${AREA_NOMBRE}</w:t>
+          <w:sz w:val="24"/>
+        </w:rPr>
+        <w:t>${AREA_NOMBRE}</w:t>
       </w:r>
     </w:p>
     <w:tbl>
       <w:tblPr>
-        <w:tblStyle w:val="TableGrid"/>
         <w:tblW w:w="9072" w:type="dxa"/>
-        <w:tblLook w:val="04A0"/>
+        <w:tblLook w:val="04A0" w:firstRow="1" w:lastRow="0" w:firstColumn="1" w:lastColumn="0" w:noHBand="0" w:noVBand="1"/>
       </w:tblPr>
       <w:tblGrid>
-        <w:gridCol w:w="350"/>
-        <w:gridCol w:w="800"/>
-        <w:gridCol w:w="2200"/>
-        <w:gridCol w:w="380"/>
-        <w:gridCol w:w="380"/>
-        <w:gridCol w:w="420"/>
-        <w:gridCol w:w="450"/>
-        <w:gridCol w:w="800"/>
-        <w:gridCol w:w="1292"/>
+        <w:gridCol w:w="971"/>
+        <w:gridCol w:w="1250"/>
+        <w:gridCol w:w="1143"/>
+        <w:gridCol w:w="756"/>
+        <w:gridCol w:w="745"/>
+        <w:gridCol w:w="1153"/>
+        <w:gridCol w:w="1325"/>
+        <w:gridCol w:w="1035"/>
+        <w:gridCol w:w="1368"/>
       </w:tblGrid>
       <w:tr>
         <w:trPr>
@@ -1286,17 +1235,17 @@
           </w:tcPr>
           <w:p>
             <w:pPr>
+              <w:spacing w:after="0"/>
               <w:jc w:val="center"/>
-              <w:spacing w:before="0" w:after="0"/>
             </w:pPr>
             <w:r>
               <w:rPr>
                 <w:rFonts w:ascii="Times New Roman" w:hAnsi="Times New Roman"/>
-                <w:sz w:val="20"/>
                 <w:b/>
                 <w:bCs/>
+                <w:sz w:val="20"/>
               </w:rPr>
-              <w:t xml:space="preserve">ITEM</w:t>
+              <w:t>ITEM</w:t>
             </w:r>
           </w:p>
         </w:tc>
@@ -1308,17 +1257,17 @@
           </w:tcPr>
           <w:p>
             <w:pPr>
+              <w:spacing w:after="0"/>
               <w:jc w:val="center"/>
-              <w:spacing w:before="0" w:after="0"/>
             </w:pPr>
             <w:r>
               <w:rPr>
                 <w:rFonts w:ascii="Times New Roman" w:hAnsi="Times New Roman"/>
-                <w:sz w:val="20"/>
                 <w:b/>
                 <w:bCs/>
+                <w:sz w:val="20"/>
               </w:rPr>
-              <w:t xml:space="preserve">CÓDIGO</w:t>
+              <w:t>CÓDIGO</w:t>
             </w:r>
           </w:p>
         </w:tc>
@@ -1330,17 +1279,16 @@
           </w:tcPr>
           <w:p>
             <w:pPr>
-              <w:jc w:val="left"/>
-              <w:spacing w:before="0" w:after="0"/>
+              <w:spacing w:after="0"/>
             </w:pPr>
             <w:r>
               <w:rPr>
                 <w:rFonts w:ascii="Times New Roman" w:hAnsi="Times New Roman"/>
-                <w:sz w:val="20"/>
                 <w:b/>
                 <w:bCs/>
+                <w:sz w:val="20"/>
               </w:rPr>
-              <w:t xml:space="preserve">CURSO</w:t>
+              <w:t>CURSO</w:t>
             </w:r>
           </w:p>
         </w:tc>
@@ -1352,17 +1300,17 @@
           </w:tcPr>
           <w:p>
             <w:pPr>
+              <w:spacing w:after="0"/>
               <w:jc w:val="center"/>
-              <w:spacing w:before="0" w:after="0"/>
             </w:pPr>
             <w:r>
               <w:rPr>
                 <w:rFonts w:ascii="Times New Roman" w:hAnsi="Times New Roman"/>
-                <w:sz w:val="20"/>
                 <w:b/>
                 <w:bCs/>
+                <w:sz w:val="20"/>
               </w:rPr>
-              <w:t xml:space="preserve">H.T</w:t>
+              <w:t>H.T</w:t>
             </w:r>
           </w:p>
         </w:tc>
@@ -1374,17 +1322,17 @@
           </w:tcPr>
           <w:p>
             <w:pPr>
+              <w:spacing w:after="0"/>
               <w:jc w:val="center"/>
-              <w:spacing w:before="0" w:after="0"/>
             </w:pPr>
             <w:r>
               <w:rPr>
                 <w:rFonts w:ascii="Times New Roman" w:hAnsi="Times New Roman"/>
-                <w:sz w:val="20"/>
                 <w:b/>
                 <w:bCs/>
+                <w:sz w:val="20"/>
               </w:rPr>
-              <w:t xml:space="preserve">H.P</w:t>
+              <w:t>H.P</w:t>
             </w:r>
           </w:p>
         </w:tc>
@@ -1396,17 +1344,17 @@
           </w:tcPr>
           <w:p>
             <w:pPr>
+              <w:spacing w:after="0"/>
               <w:jc w:val="center"/>
-              <w:spacing w:before="0" w:after="0"/>
             </w:pPr>
             <w:r>
               <w:rPr>
                 <w:rFonts w:ascii="Times New Roman" w:hAnsi="Times New Roman"/>
-                <w:sz w:val="20"/>
                 <w:b/>
                 <w:bCs/>
+                <w:sz w:val="20"/>
               </w:rPr>
-              <w:t xml:space="preserve">GRUPO</w:t>
+              <w:t>GRUPO</w:t>
             </w:r>
           </w:p>
         </w:tc>
@@ -1418,17 +1366,17 @@
           </w:tcPr>
           <w:p>
             <w:pPr>
+              <w:spacing w:after="0"/>
               <w:jc w:val="center"/>
-              <w:spacing w:before="0" w:after="0"/>
             </w:pPr>
             <w:r>
               <w:rPr>
                 <w:rFonts w:ascii="Times New Roman" w:hAnsi="Times New Roman"/>
-                <w:sz w:val="20"/>
                 <w:b/>
                 <w:bCs/>
+                <w:sz w:val="20"/>
               </w:rPr>
-              <w:t xml:space="preserve">SECCIÓN</w:t>
+              <w:t>SECCIÓN</w:t>
             </w:r>
           </w:p>
         </w:tc>
@@ -1440,17 +1388,17 @@
           </w:tcPr>
           <w:p>
             <w:pPr>
+              <w:spacing w:after="0"/>
               <w:jc w:val="center"/>
-              <w:spacing w:before="0" w:after="0"/>
             </w:pPr>
             <w:r>
               <w:rPr>
                 <w:rFonts w:ascii="Times New Roman" w:hAnsi="Times New Roman"/>
-                <w:sz w:val="20"/>
                 <w:b/>
                 <w:bCs/>
+                <w:sz w:val="20"/>
               </w:rPr>
-              <w:t xml:space="preserve">AULA</w:t>
+              <w:t>AULA</w:t>
             </w:r>
           </w:p>
         </w:tc>
@@ -1462,17 +1410,17 @@
           </w:tcPr>
           <w:p>
             <w:pPr>
+              <w:spacing w:after="0"/>
               <w:jc w:val="center"/>
-              <w:spacing w:before="0" w:after="0"/>
             </w:pPr>
             <w:r>
               <w:rPr>
                 <w:rFonts w:ascii="Times New Roman" w:hAnsi="Times New Roman"/>
-                <w:sz w:val="20"/>
                 <w:b/>
                 <w:bCs/>
+                <w:sz w:val="20"/>
               </w:rPr>
-              <w:t xml:space="preserve">ESCUELA</w:t>
+              <w:t>ESCUELA</w:t>
             </w:r>
           </w:p>
         </w:tc>
@@ -1488,15 +1436,15 @@
           </w:tcPr>
           <w:p>
             <w:pPr>
+              <w:spacing w:after="0"/>
               <w:jc w:val="center"/>
-              <w:spacing w:before="0" w:after="0"/>
             </w:pPr>
             <w:r>
               <w:rPr>
                 <w:rFonts w:ascii="Times New Roman" w:hAnsi="Times New Roman"/>
                 <w:sz w:val="20"/>
               </w:rPr>
-              <w:t xml:space="preserve">${ITEM}</w:t>
+              <w:t>${ITEM}</w:t>
             </w:r>
           </w:p>
         </w:tc>
@@ -1507,15 +1455,15 @@
           </w:tcPr>
           <w:p>
             <w:pPr>
+              <w:spacing w:after="0"/>
               <w:jc w:val="center"/>
-              <w:spacing w:before="0" w:after="0"/>
             </w:pPr>
             <w:r>
               <w:rPr>
                 <w:rFonts w:ascii="Times New Roman" w:hAnsi="Times New Roman"/>
                 <w:sz w:val="20"/>
               </w:rPr>
-              <w:t xml:space="preserve">${CODIGO}</w:t>
+              <w:t>${CODIGO}</w:t>
             </w:r>
           </w:p>
         </w:tc>
@@ -1526,15 +1474,14 @@
           </w:tcPr>
           <w:p>
             <w:pPr>
-              <w:jc w:val="left"/>
-              <w:spacing w:before="0" w:after="0"/>
+              <w:spacing w:after="0"/>
             </w:pPr>
             <w:r>
               <w:rPr>
                 <w:rFonts w:ascii="Times New Roman" w:hAnsi="Times New Roman"/>
                 <w:sz w:val="20"/>
               </w:rPr>
-              <w:t xml:space="preserve">${CURSO}</w:t>
+              <w:t>${CURSO}</w:t>
             </w:r>
           </w:p>
         </w:tc>
@@ -1545,15 +1492,15 @@
           </w:tcPr>
           <w:p>
             <w:pPr>
+              <w:spacing w:after="0"/>
               <w:jc w:val="center"/>
-              <w:spacing w:before="0" w:after="0"/>
             </w:pPr>
             <w:r>
               <w:rPr>
                 <w:rFonts w:ascii="Times New Roman" w:hAnsi="Times New Roman"/>
                 <w:sz w:val="20"/>
               </w:rPr>
-              <w:t xml:space="preserve">${HT}</w:t>
+              <w:t>${HT}</w:t>
             </w:r>
           </w:p>
         </w:tc>
@@ -1564,15 +1511,15 @@
           </w:tcPr>
           <w:p>
             <w:pPr>
+              <w:spacing w:after="0"/>
               <w:jc w:val="center"/>
-              <w:spacing w:before="0" w:after="0"/>
             </w:pPr>
             <w:r>
               <w:rPr>
                 <w:rFonts w:ascii="Times New Roman" w:hAnsi="Times New Roman"/>
                 <w:sz w:val="20"/>
               </w:rPr>
-              <w:t xml:space="preserve">${HP}</w:t>
+              <w:t>${HP}</w:t>
             </w:r>
           </w:p>
         </w:tc>
@@ -1583,15 +1530,15 @@
           </w:tcPr>
           <w:p>
             <w:pPr>
+              <w:spacing w:after="0"/>
               <w:jc w:val="center"/>
-              <w:spacing w:before="0" w:after="0"/>
             </w:pPr>
             <w:r>
               <w:rPr>
                 <w:rFonts w:ascii="Times New Roman" w:hAnsi="Times New Roman"/>
                 <w:sz w:val="20"/>
               </w:rPr>
-              <w:t xml:space="preserve">${GRUPO}</w:t>
+              <w:t>${GRUPO}</w:t>
             </w:r>
           </w:p>
         </w:tc>
@@ -1602,15 +1549,15 @@
           </w:tcPr>
           <w:p>
             <w:pPr>
+              <w:spacing w:after="0"/>
               <w:jc w:val="center"/>
-              <w:spacing w:before="0" w:after="0"/>
             </w:pPr>
             <w:r>
               <w:rPr>
                 <w:rFonts w:ascii="Times New Roman" w:hAnsi="Times New Roman"/>
                 <w:sz w:val="20"/>
               </w:rPr>
-              <w:t xml:space="preserve">${SECCION}</w:t>
+              <w:t>${SECCION}</w:t>
             </w:r>
           </w:p>
         </w:tc>
@@ -1621,15 +1568,15 @@
           </w:tcPr>
           <w:p>
             <w:pPr>
+              <w:spacing w:after="0"/>
               <w:jc w:val="center"/>
-              <w:spacing w:before="0" w:after="0"/>
             </w:pPr>
             <w:r>
               <w:rPr>
                 <w:rFonts w:ascii="Times New Roman" w:hAnsi="Times New Roman"/>
                 <w:sz w:val="20"/>
               </w:rPr>
-              <w:t xml:space="preserve">${AULA}</w:t>
+              <w:t>${AULA}</w:t>
             </w:r>
           </w:p>
         </w:tc>
@@ -1640,15 +1587,15 @@
           </w:tcPr>
           <w:p>
             <w:pPr>
+              <w:spacing w:after="0"/>
               <w:jc w:val="center"/>
-              <w:spacing w:before="0" w:after="0"/>
             </w:pPr>
             <w:r>
               <w:rPr>
                 <w:rFonts w:ascii="Times New Roman" w:hAnsi="Times New Roman"/>
                 <w:sz w:val="20"/>
               </w:rPr>
-              <w:t xml:space="preserve">${ESCUELA}</w:t>
+              <w:t>${ESCUELA}</w:t>
             </w:r>
           </w:p>
         </w:tc>
@@ -1682,22 +1629,14 @@
           <w:szCs w:val="20"/>
         </w:rPr>
       </w:pPr>
-      <w:r>
-        <w:rPr>
-          <w:i/>
-          <w:sz w:val="20"/>
-          <w:szCs w:val="20"/>
-        </w:rPr>
-        <w:br w:type="page"/>
-      </w:r>
     </w:p>
     <w:sectPr>
-      <w:headerReference w:type="even" r:id="rId26"/>
-      <w:headerReference w:type="default" r:id="rId27"/>
-      <w:footerReference w:type="even" r:id="rId28"/>
-      <w:footerReference w:type="default" r:id="rId29"/>
-      <w:headerReference w:type="first" r:id="rId30"/>
-      <w:footerReference w:type="first" r:id="rId31"/>
+      <w:headerReference w:type="even" r:id="rId10"/>
+      <w:headerReference w:type="default" r:id="rId11"/>
+      <w:footerReference w:type="even" r:id="rId12"/>
+      <w:footerReference w:type="default" r:id="rId13"/>
+      <w:headerReference w:type="first" r:id="rId14"/>
+      <w:footerReference w:type="first" r:id="rId15"/>
       <w:pgSz w:w="11906" w:h="16838"/>
       <w:pgMar w:top="568" w:right="1080" w:bottom="284" w:left="1080" w:header="426" w:footer="708" w:gutter="0"/>
       <w:cols w:space="708"/>
@@ -1708,7 +1647,7 @@
 </file>
 
 <file path=word/endnotes.xml><?xml version="1.0" encoding="utf-8"?>
-<w:endnotes xmlns:wpc="http://schemas.microsoft.com/office/word/2010/wordprocessingCanvas" xmlns:cx="http://schemas.microsoft.com/office/drawing/2014/chartex" xmlns:mc="http://schemas.openxmlformats.org/markup-compatibility/2006" xmlns:o="urn:schemas-microsoft-com:office:office" xmlns:r="http://schemas.openxmlformats.org/officeDocument/2006/relationships" xmlns:m="http://schemas.openxmlformats.org/officeDocument/2006/math" xmlns:v="urn:schemas-microsoft-com:vml" xmlns:wp14="http://schemas.microsoft.com/office/word/2010/wordprocessingDrawing" xmlns:wp="http://schemas.openxmlformats.org/drawingml/2006/wordprocessingDrawing" xmlns:w10="urn:schemas-microsoft-com:office:word" xmlns:w="http://schemas.openxmlformats.org/wordprocessingml/2006/main" xmlns:w14="http://schemas.microsoft.com/office/word/2010/wordml" xmlns:w15="http://schemas.microsoft.com/office/word/2012/wordml" xmlns:w16se="http://schemas.microsoft.com/office/word/2015/wordml/symex" xmlns:wpg="http://schemas.microsoft.com/office/word/2010/wordprocessingGroup" xmlns:wpi="http://schemas.microsoft.com/office/word/2010/wordprocessingInk" xmlns:wne="http://schemas.microsoft.com/office/word/2006/wordml" xmlns:wps="http://schemas.microsoft.com/office/word/2010/wordprocessingShape" mc:Ignorable="w14 w15 w16se wp14">
+<w:endnotes xmlns:wpc="http://schemas.microsoft.com/office/word/2010/wordprocessingCanvas" xmlns:cx="http://schemas.microsoft.com/office/drawing/2014/chartex" xmlns:cx1="http://schemas.microsoft.com/office/drawing/2015/9/8/chartex" xmlns:cx2="http://schemas.microsoft.com/office/drawing/2015/10/21/chartex" xmlns:cx3="http://schemas.microsoft.com/office/drawing/2016/5/9/chartex" xmlns:cx4="http://schemas.microsoft.com/office/drawing/2016/5/10/chartex" xmlns:cx5="http://schemas.microsoft.com/office/drawing/2016/5/11/chartex" xmlns:cx6="http://schemas.microsoft.com/office/drawing/2016/5/12/chartex" xmlns:cx7="http://schemas.microsoft.com/office/drawing/2016/5/13/chartex" xmlns:cx8="http://schemas.microsoft.com/office/drawing/2016/5/14/chartex" xmlns:mc="http://schemas.openxmlformats.org/markup-compatibility/2006" xmlns:aink="http://schemas.microsoft.com/office/drawing/2016/ink" xmlns:am3d="http://schemas.microsoft.com/office/drawing/2017/model3d" xmlns:o="urn:schemas-microsoft-com:office:office" xmlns:oel="http://schemas.microsoft.com/office/2019/extlst" xmlns:r="http://schemas.openxmlformats.org/officeDocument/2006/relationships" xmlns:m="http://schemas.openxmlformats.org/officeDocument/2006/math" xmlns:v="urn:schemas-microsoft-com:vml" xmlns:wp14="http://schemas.microsoft.com/office/word/2010/wordprocessingDrawing" xmlns:wp="http://schemas.openxmlformats.org/drawingml/2006/wordprocessingDrawing" xmlns:w10="urn:schemas-microsoft-com:office:word" xmlns:w="http://schemas.openxmlformats.org/wordprocessingml/2006/main" xmlns:w14="http://schemas.microsoft.com/office/word/2010/wordml" xmlns:w15="http://schemas.microsoft.com/office/word/2012/wordml" xmlns:w16cex="http://schemas.microsoft.com/office/word/2018/wordml/cex" xmlns:w16cid="http://schemas.microsoft.com/office/word/2016/wordml/cid" xmlns:w16="http://schemas.microsoft.com/office/word/2018/wordml" xmlns:w16du="http://schemas.microsoft.com/office/word/2023/wordml/word16du" xmlns:w16sdtdh="http://schemas.microsoft.com/office/word/2020/wordml/sdtdatahash" xmlns:w16sdtfl="http://schemas.microsoft.com/office/word/2024/wordml/sdtformatlock" xmlns:w16se="http://schemas.microsoft.com/office/word/2015/wordml/symex" xmlns:wpg="http://schemas.microsoft.com/office/word/2010/wordprocessingGroup" xmlns:wpi="http://schemas.microsoft.com/office/word/2010/wordprocessingInk" xmlns:wne="http://schemas.microsoft.com/office/word/2006/wordml" xmlns:wps="http://schemas.microsoft.com/office/word/2010/wordprocessingShape" mc:Ignorable="w14 w15 w16se w16cid w16 w16cex w16sdtdh w16sdtfl w16du wp14">
   <w:endnote w:type="separator" w:id="-1">
     <w:p>
       <w:pPr>
@@ -1733,7 +1672,7 @@
 </file>
 
 <file path=word/footer1.xml><?xml version="1.0" encoding="utf-8"?>
-<w:ftr xmlns:wpc="http://schemas.microsoft.com/office/word/2010/wordprocessingCanvas" xmlns:cx="http://schemas.microsoft.com/office/drawing/2014/chartex" xmlns:mc="http://schemas.openxmlformats.org/markup-compatibility/2006" xmlns:o="urn:schemas-microsoft-com:office:office" xmlns:r="http://schemas.openxmlformats.org/officeDocument/2006/relationships" xmlns:m="http://schemas.openxmlformats.org/officeDocument/2006/math" xmlns:v="urn:schemas-microsoft-com:vml" xmlns:wp14="http://schemas.microsoft.com/office/word/2010/wordprocessingDrawing" xmlns:wp="http://schemas.openxmlformats.org/drawingml/2006/wordprocessingDrawing" xmlns:w10="urn:schemas-microsoft-com:office:word" xmlns:w="http://schemas.openxmlformats.org/wordprocessingml/2006/main" xmlns:w14="http://schemas.microsoft.com/office/word/2010/wordml" xmlns:w15="http://schemas.microsoft.com/office/word/2012/wordml" xmlns:w16se="http://schemas.microsoft.com/office/word/2015/wordml/symex" xmlns:wpg="http://schemas.microsoft.com/office/word/2010/wordprocessingGroup" xmlns:wpi="http://schemas.microsoft.com/office/word/2010/wordprocessingInk" xmlns:wne="http://schemas.microsoft.com/office/word/2006/wordml" xmlns:wps="http://schemas.microsoft.com/office/word/2010/wordprocessingShape" mc:Ignorable="w14 w15 w16se wp14">
+<w:ftr xmlns:wpc="http://schemas.microsoft.com/office/word/2010/wordprocessingCanvas" xmlns:cx="http://schemas.microsoft.com/office/drawing/2014/chartex" xmlns:cx1="http://schemas.microsoft.com/office/drawing/2015/9/8/chartex" xmlns:cx2="http://schemas.microsoft.com/office/drawing/2015/10/21/chartex" xmlns:cx3="http://schemas.microsoft.com/office/drawing/2016/5/9/chartex" xmlns:cx4="http://schemas.microsoft.com/office/drawing/2016/5/10/chartex" xmlns:cx5="http://schemas.microsoft.com/office/drawing/2016/5/11/chartex" xmlns:cx6="http://schemas.microsoft.com/office/drawing/2016/5/12/chartex" xmlns:cx7="http://schemas.microsoft.com/office/drawing/2016/5/13/chartex" xmlns:cx8="http://schemas.microsoft.com/office/drawing/2016/5/14/chartex" xmlns:mc="http://schemas.openxmlformats.org/markup-compatibility/2006" xmlns:aink="http://schemas.microsoft.com/office/drawing/2016/ink" xmlns:am3d="http://schemas.microsoft.com/office/drawing/2017/model3d" xmlns:o="urn:schemas-microsoft-com:office:office" xmlns:oel="http://schemas.microsoft.com/office/2019/extlst" xmlns:r="http://schemas.openxmlformats.org/officeDocument/2006/relationships" xmlns:m="http://schemas.openxmlformats.org/officeDocument/2006/math" xmlns:v="urn:schemas-microsoft-com:vml" xmlns:wp14="http://schemas.microsoft.com/office/word/2010/wordprocessingDrawing" xmlns:wp="http://schemas.openxmlformats.org/drawingml/2006/wordprocessingDrawing" xmlns:w10="urn:schemas-microsoft-com:office:word" xmlns:w="http://schemas.openxmlformats.org/wordprocessingml/2006/main" xmlns:w14="http://schemas.microsoft.com/office/word/2010/wordml" xmlns:w15="http://schemas.microsoft.com/office/word/2012/wordml" xmlns:w16cex="http://schemas.microsoft.com/office/word/2018/wordml/cex" xmlns:w16cid="http://schemas.microsoft.com/office/word/2016/wordml/cid" xmlns:w16="http://schemas.microsoft.com/office/word/2018/wordml" xmlns:w16du="http://schemas.microsoft.com/office/word/2023/wordml/word16du" xmlns:w16sdtdh="http://schemas.microsoft.com/office/word/2020/wordml/sdtdatahash" xmlns:w16sdtfl="http://schemas.microsoft.com/office/word/2024/wordml/sdtformatlock" xmlns:w16se="http://schemas.microsoft.com/office/word/2015/wordml/symex" xmlns:wpg="http://schemas.microsoft.com/office/word/2010/wordprocessingGroup" xmlns:wpi="http://schemas.microsoft.com/office/word/2010/wordprocessingInk" xmlns:wne="http://schemas.microsoft.com/office/word/2006/wordml" xmlns:wps="http://schemas.microsoft.com/office/word/2010/wordprocessingShape" mc:Ignorable="w14 w15 w16se w16cid w16 w16cex w16sdtdh w16sdtfl w16du wp14">
   <w:p>
     <w:pPr>
       <w:pStyle w:val="Piedepgina"/>
@@ -1743,7 +1682,7 @@
 </file>
 
 <file path=word/footer2.xml><?xml version="1.0" encoding="utf-8"?>
-<w:ftr xmlns:wpc="http://schemas.microsoft.com/office/word/2010/wordprocessingCanvas" xmlns:cx="http://schemas.microsoft.com/office/drawing/2014/chartex" xmlns:mc="http://schemas.openxmlformats.org/markup-compatibility/2006" xmlns:o="urn:schemas-microsoft-com:office:office" xmlns:r="http://schemas.openxmlformats.org/officeDocument/2006/relationships" xmlns:m="http://schemas.openxmlformats.org/officeDocument/2006/math" xmlns:v="urn:schemas-microsoft-com:vml" xmlns:wp14="http://schemas.microsoft.com/office/word/2010/wordprocessingDrawing" xmlns:wp="http://schemas.openxmlformats.org/drawingml/2006/wordprocessingDrawing" xmlns:w10="urn:schemas-microsoft-com:office:word" xmlns:w="http://schemas.openxmlformats.org/wordprocessingml/2006/main" xmlns:w14="http://schemas.microsoft.com/office/word/2010/wordml" xmlns:w15="http://schemas.microsoft.com/office/word/2012/wordml" xmlns:w16se="http://schemas.microsoft.com/office/word/2015/wordml/symex" xmlns:wpg="http://schemas.microsoft.com/office/word/2010/wordprocessingGroup" xmlns:wpi="http://schemas.microsoft.com/office/word/2010/wordprocessingInk" xmlns:wne="http://schemas.microsoft.com/office/word/2006/wordml" xmlns:wps="http://schemas.microsoft.com/office/word/2010/wordprocessingShape" mc:Ignorable="w14 w15 w16se wp14">
+<w:ftr xmlns:wpc="http://schemas.microsoft.com/office/word/2010/wordprocessingCanvas" xmlns:cx="http://schemas.microsoft.com/office/drawing/2014/chartex" xmlns:cx1="http://schemas.microsoft.com/office/drawing/2015/9/8/chartex" xmlns:cx2="http://schemas.microsoft.com/office/drawing/2015/10/21/chartex" xmlns:cx3="http://schemas.microsoft.com/office/drawing/2016/5/9/chartex" xmlns:cx4="http://schemas.microsoft.com/office/drawing/2016/5/10/chartex" xmlns:cx5="http://schemas.microsoft.com/office/drawing/2016/5/11/chartex" xmlns:cx6="http://schemas.microsoft.com/office/drawing/2016/5/12/chartex" xmlns:cx7="http://schemas.microsoft.com/office/drawing/2016/5/13/chartex" xmlns:cx8="http://schemas.microsoft.com/office/drawing/2016/5/14/chartex" xmlns:mc="http://schemas.openxmlformats.org/markup-compatibility/2006" xmlns:aink="http://schemas.microsoft.com/office/drawing/2016/ink" xmlns:am3d="http://schemas.microsoft.com/office/drawing/2017/model3d" xmlns:o="urn:schemas-microsoft-com:office:office" xmlns:oel="http://schemas.microsoft.com/office/2019/extlst" xmlns:r="http://schemas.openxmlformats.org/officeDocument/2006/relationships" xmlns:m="http://schemas.openxmlformats.org/officeDocument/2006/math" xmlns:v="urn:schemas-microsoft-com:vml" xmlns:wp14="http://schemas.microsoft.com/office/word/2010/wordprocessingDrawing" xmlns:wp="http://schemas.openxmlformats.org/drawingml/2006/wordprocessingDrawing" xmlns:w10="urn:schemas-microsoft-com:office:word" xmlns:w="http://schemas.openxmlformats.org/wordprocessingml/2006/main" xmlns:w14="http://schemas.microsoft.com/office/word/2010/wordml" xmlns:w15="http://schemas.microsoft.com/office/word/2012/wordml" xmlns:w16cex="http://schemas.microsoft.com/office/word/2018/wordml/cex" xmlns:w16cid="http://schemas.microsoft.com/office/word/2016/wordml/cid" xmlns:w16="http://schemas.microsoft.com/office/word/2018/wordml" xmlns:w16du="http://schemas.microsoft.com/office/word/2023/wordml/word16du" xmlns:w16sdtdh="http://schemas.microsoft.com/office/word/2020/wordml/sdtdatahash" xmlns:w16sdtfl="http://schemas.microsoft.com/office/word/2024/wordml/sdtformatlock" xmlns:w16se="http://schemas.microsoft.com/office/word/2015/wordml/symex" xmlns:wpg="http://schemas.microsoft.com/office/word/2010/wordprocessingGroup" xmlns:wpi="http://schemas.microsoft.com/office/word/2010/wordprocessingInk" xmlns:wne="http://schemas.microsoft.com/office/word/2006/wordml" xmlns:wps="http://schemas.microsoft.com/office/word/2010/wordprocessingShape" mc:Ignorable="w14 w15 w16se w16cid w16 w16cex w16sdtdh w16sdtfl w16du wp14">
   <w:p>
     <w:pPr>
       <w:pStyle w:val="Piedepgina"/>
@@ -1753,7 +1692,7 @@
 </file>
 
 <file path=word/footer3.xml><?xml version="1.0" encoding="utf-8"?>
-<w:ftr xmlns:wpc="http://schemas.microsoft.com/office/word/2010/wordprocessingCanvas" xmlns:cx="http://schemas.microsoft.com/office/drawing/2014/chartex" xmlns:mc="http://schemas.openxmlformats.org/markup-compatibility/2006" xmlns:o="urn:schemas-microsoft-com:office:office" xmlns:r="http://schemas.openxmlformats.org/officeDocument/2006/relationships" xmlns:m="http://schemas.openxmlformats.org/officeDocument/2006/math" xmlns:v="urn:schemas-microsoft-com:vml" xmlns:wp14="http://schemas.microsoft.com/office/word/2010/wordprocessingDrawing" xmlns:wp="http://schemas.openxmlformats.org/drawingml/2006/wordprocessingDrawing" xmlns:w10="urn:schemas-microsoft-com:office:word" xmlns:w="http://schemas.openxmlformats.org/wordprocessingml/2006/main" xmlns:w14="http://schemas.microsoft.com/office/word/2010/wordml" xmlns:w15="http://schemas.microsoft.com/office/word/2012/wordml" xmlns:w16se="http://schemas.microsoft.com/office/word/2015/wordml/symex" xmlns:wpg="http://schemas.microsoft.com/office/word/2010/wordprocessingGroup" xmlns:wpi="http://schemas.microsoft.com/office/word/2010/wordprocessingInk" xmlns:wne="http://schemas.microsoft.com/office/word/2006/wordml" xmlns:wps="http://schemas.microsoft.com/office/word/2010/wordprocessingShape" mc:Ignorable="w14 w15 w16se wp14">
+<w:ftr xmlns:wpc="http://schemas.microsoft.com/office/word/2010/wordprocessingCanvas" xmlns:cx="http://schemas.microsoft.com/office/drawing/2014/chartex" xmlns:cx1="http://schemas.microsoft.com/office/drawing/2015/9/8/chartex" xmlns:cx2="http://schemas.microsoft.com/office/drawing/2015/10/21/chartex" xmlns:cx3="http://schemas.microsoft.com/office/drawing/2016/5/9/chartex" xmlns:cx4="http://schemas.microsoft.com/office/drawing/2016/5/10/chartex" xmlns:cx5="http://schemas.microsoft.com/office/drawing/2016/5/11/chartex" xmlns:cx6="http://schemas.microsoft.com/office/drawing/2016/5/12/chartex" xmlns:cx7="http://schemas.microsoft.com/office/drawing/2016/5/13/chartex" xmlns:cx8="http://schemas.microsoft.com/office/drawing/2016/5/14/chartex" xmlns:mc="http://schemas.openxmlformats.org/markup-compatibility/2006" xmlns:aink="http://schemas.microsoft.com/office/drawing/2016/ink" xmlns:am3d="http://schemas.microsoft.com/office/drawing/2017/model3d" xmlns:o="urn:schemas-microsoft-com:office:office" xmlns:oel="http://schemas.microsoft.com/office/2019/extlst" xmlns:r="http://schemas.openxmlformats.org/officeDocument/2006/relationships" xmlns:m="http://schemas.openxmlformats.org/officeDocument/2006/math" xmlns:v="urn:schemas-microsoft-com:vml" xmlns:wp14="http://schemas.microsoft.com/office/word/2010/wordprocessingDrawing" xmlns:wp="http://schemas.openxmlformats.org/drawingml/2006/wordprocessingDrawing" xmlns:w10="urn:schemas-microsoft-com:office:word" xmlns:w="http://schemas.openxmlformats.org/wordprocessingml/2006/main" xmlns:w14="http://schemas.microsoft.com/office/word/2010/wordml" xmlns:w15="http://schemas.microsoft.com/office/word/2012/wordml" xmlns:w16cex="http://schemas.microsoft.com/office/word/2018/wordml/cex" xmlns:w16cid="http://schemas.microsoft.com/office/word/2016/wordml/cid" xmlns:w16="http://schemas.microsoft.com/office/word/2018/wordml" xmlns:w16du="http://schemas.microsoft.com/office/word/2023/wordml/word16du" xmlns:w16sdtdh="http://schemas.microsoft.com/office/word/2020/wordml/sdtdatahash" xmlns:w16sdtfl="http://schemas.microsoft.com/office/word/2024/wordml/sdtformatlock" xmlns:w16se="http://schemas.microsoft.com/office/word/2015/wordml/symex" xmlns:wpg="http://schemas.microsoft.com/office/word/2010/wordprocessingGroup" xmlns:wpi="http://schemas.microsoft.com/office/word/2010/wordprocessingInk" xmlns:wne="http://schemas.microsoft.com/office/word/2006/wordml" xmlns:wps="http://schemas.microsoft.com/office/word/2010/wordprocessingShape" mc:Ignorable="w14 w15 w16se w16cid w16 w16cex w16sdtdh w16sdtfl w16du wp14">
   <w:p>
     <w:pPr>
       <w:pStyle w:val="Piedepgina"/>
@@ -1763,7 +1702,7 @@
 </file>
 
 <file path=word/footnotes.xml><?xml version="1.0" encoding="utf-8"?>
-<w:footnotes xmlns:wpc="http://schemas.microsoft.com/office/word/2010/wordprocessingCanvas" xmlns:cx="http://schemas.microsoft.com/office/drawing/2014/chartex" xmlns:mc="http://schemas.openxmlformats.org/markup-compatibility/2006" xmlns:o="urn:schemas-microsoft-com:office:office" xmlns:r="http://schemas.openxmlformats.org/officeDocument/2006/relationships" xmlns:m="http://schemas.openxmlformats.org/officeDocument/2006/math" xmlns:v="urn:schemas-microsoft-com:vml" xmlns:wp14="http://schemas.microsoft.com/office/word/2010/wordprocessingDrawing" xmlns:wp="http://schemas.openxmlformats.org/drawingml/2006/wordprocessingDrawing" xmlns:w10="urn:schemas-microsoft-com:office:word" xmlns:w="http://schemas.openxmlformats.org/wordprocessingml/2006/main" xmlns:w14="http://schemas.microsoft.com/office/word/2010/wordml" xmlns:w15="http://schemas.microsoft.com/office/word/2012/wordml" xmlns:w16se="http://schemas.microsoft.com/office/word/2015/wordml/symex" xmlns:wpg="http://schemas.microsoft.com/office/word/2010/wordprocessingGroup" xmlns:wpi="http://schemas.microsoft.com/office/word/2010/wordprocessingInk" xmlns:wne="http://schemas.microsoft.com/office/word/2006/wordml" xmlns:wps="http://schemas.microsoft.com/office/word/2010/wordprocessingShape" mc:Ignorable="w14 w15 w16se wp14">
+<w:footnotes xmlns:wpc="http://schemas.microsoft.com/office/word/2010/wordprocessingCanvas" xmlns:cx="http://schemas.microsoft.com/office/drawing/2014/chartex" xmlns:cx1="http://schemas.microsoft.com/office/drawing/2015/9/8/chartex" xmlns:cx2="http://schemas.microsoft.com/office/drawing/2015/10/21/chartex" xmlns:cx3="http://schemas.microsoft.com/office/drawing/2016/5/9/chartex" xmlns:cx4="http://schemas.microsoft.com/office/drawing/2016/5/10/chartex" xmlns:cx5="http://schemas.microsoft.com/office/drawing/2016/5/11/chartex" xmlns:cx6="http://schemas.microsoft.com/office/drawing/2016/5/12/chartex" xmlns:cx7="http://schemas.microsoft.com/office/drawing/2016/5/13/chartex" xmlns:cx8="http://schemas.microsoft.com/office/drawing/2016/5/14/chartex" xmlns:mc="http://schemas.openxmlformats.org/markup-compatibility/2006" xmlns:aink="http://schemas.microsoft.com/office/drawing/2016/ink" xmlns:am3d="http://schemas.microsoft.com/office/drawing/2017/model3d" xmlns:o="urn:schemas-microsoft-com:office:office" xmlns:oel="http://schemas.microsoft.com/office/2019/extlst" xmlns:r="http://schemas.openxmlformats.org/officeDocument/2006/relationships" xmlns:m="http://schemas.openxmlformats.org/officeDocument/2006/math" xmlns:v="urn:schemas-microsoft-com:vml" xmlns:wp14="http://schemas.microsoft.com/office/word/2010/wordprocessingDrawing" xmlns:wp="http://schemas.openxmlformats.org/drawingml/2006/wordprocessingDrawing" xmlns:w10="urn:schemas-microsoft-com:office:word" xmlns:w="http://schemas.openxmlformats.org/wordprocessingml/2006/main" xmlns:w14="http://schemas.microsoft.com/office/word/2010/wordml" xmlns:w15="http://schemas.microsoft.com/office/word/2012/wordml" xmlns:w16cex="http://schemas.microsoft.com/office/word/2018/wordml/cex" xmlns:w16cid="http://schemas.microsoft.com/office/word/2016/wordml/cid" xmlns:w16="http://schemas.microsoft.com/office/word/2018/wordml" xmlns:w16du="http://schemas.microsoft.com/office/word/2023/wordml/word16du" xmlns:w16sdtdh="http://schemas.microsoft.com/office/word/2020/wordml/sdtdatahash" xmlns:w16sdtfl="http://schemas.microsoft.com/office/word/2024/wordml/sdtformatlock" xmlns:w16se="http://schemas.microsoft.com/office/word/2015/wordml/symex" xmlns:wpg="http://schemas.microsoft.com/office/word/2010/wordprocessingGroup" xmlns:wpi="http://schemas.microsoft.com/office/word/2010/wordprocessingInk" xmlns:wne="http://schemas.microsoft.com/office/word/2006/wordml" xmlns:wps="http://schemas.microsoft.com/office/word/2010/wordprocessingShape" mc:Ignorable="w14 w15 w16se w16cid w16 w16cex w16sdtdh w16sdtfl w16du wp14">
   <w:footnote w:type="separator" w:id="-1">
     <w:p>
       <w:pPr>
@@ -1788,7 +1727,7 @@
 </file>
 
 <file path=word/header1.xml><?xml version="1.0" encoding="utf-8"?>
-<w:hdr xmlns:wpc="http://schemas.microsoft.com/office/word/2010/wordprocessingCanvas" xmlns:cx="http://schemas.microsoft.com/office/drawing/2014/chartex" xmlns:mc="http://schemas.openxmlformats.org/markup-compatibility/2006" xmlns:o="urn:schemas-microsoft-com:office:office" xmlns:r="http://schemas.openxmlformats.org/officeDocument/2006/relationships" xmlns:m="http://schemas.openxmlformats.org/officeDocument/2006/math" xmlns:v="urn:schemas-microsoft-com:vml" xmlns:wp14="http://schemas.microsoft.com/office/word/2010/wordprocessingDrawing" xmlns:wp="http://schemas.openxmlformats.org/drawingml/2006/wordprocessingDrawing" xmlns:w10="urn:schemas-microsoft-com:office:word" xmlns:w="http://schemas.openxmlformats.org/wordprocessingml/2006/main" xmlns:w14="http://schemas.microsoft.com/office/word/2010/wordml" xmlns:w15="http://schemas.microsoft.com/office/word/2012/wordml" xmlns:w16se="http://schemas.microsoft.com/office/word/2015/wordml/symex" xmlns:wpg="http://schemas.microsoft.com/office/word/2010/wordprocessingGroup" xmlns:wpi="http://schemas.microsoft.com/office/word/2010/wordprocessingInk" xmlns:wne="http://schemas.microsoft.com/office/word/2006/wordml" xmlns:wps="http://schemas.microsoft.com/office/word/2010/wordprocessingShape" mc:Ignorable="w14 w15 w16se wp14">
+<w:hdr xmlns:wpc="http://schemas.microsoft.com/office/word/2010/wordprocessingCanvas" xmlns:cx="http://schemas.microsoft.com/office/drawing/2014/chartex" xmlns:cx1="http://schemas.microsoft.com/office/drawing/2015/9/8/chartex" xmlns:cx2="http://schemas.microsoft.com/office/drawing/2015/10/21/chartex" xmlns:cx3="http://schemas.microsoft.com/office/drawing/2016/5/9/chartex" xmlns:cx4="http://schemas.microsoft.com/office/drawing/2016/5/10/chartex" xmlns:cx5="http://schemas.microsoft.com/office/drawing/2016/5/11/chartex" xmlns:cx6="http://schemas.microsoft.com/office/drawing/2016/5/12/chartex" xmlns:cx7="http://schemas.microsoft.com/office/drawing/2016/5/13/chartex" xmlns:cx8="http://schemas.microsoft.com/office/drawing/2016/5/14/chartex" xmlns:mc="http://schemas.openxmlformats.org/markup-compatibility/2006" xmlns:aink="http://schemas.microsoft.com/office/drawing/2016/ink" xmlns:am3d="http://schemas.microsoft.com/office/drawing/2017/model3d" xmlns:o="urn:schemas-microsoft-com:office:office" xmlns:oel="http://schemas.microsoft.com/office/2019/extlst" xmlns:r="http://schemas.openxmlformats.org/officeDocument/2006/relationships" xmlns:m="http://schemas.openxmlformats.org/officeDocument/2006/math" xmlns:v="urn:schemas-microsoft-com:vml" xmlns:wp14="http://schemas.microsoft.com/office/word/2010/wordprocessingDrawing" xmlns:wp="http://schemas.openxmlformats.org/drawingml/2006/wordprocessingDrawing" xmlns:w10="urn:schemas-microsoft-com:office:word" xmlns:w="http://schemas.openxmlformats.org/wordprocessingml/2006/main" xmlns:w14="http://schemas.microsoft.com/office/word/2010/wordml" xmlns:w15="http://schemas.microsoft.com/office/word/2012/wordml" xmlns:w16cex="http://schemas.microsoft.com/office/word/2018/wordml/cex" xmlns:w16cid="http://schemas.microsoft.com/office/word/2016/wordml/cid" xmlns:w16="http://schemas.microsoft.com/office/word/2018/wordml" xmlns:w16du="http://schemas.microsoft.com/office/word/2023/wordml/word16du" xmlns:w16sdtdh="http://schemas.microsoft.com/office/word/2020/wordml/sdtdatahash" xmlns:w16sdtfl="http://schemas.microsoft.com/office/word/2024/wordml/sdtformatlock" xmlns:w16se="http://schemas.microsoft.com/office/word/2015/wordml/symex" xmlns:wpg="http://schemas.microsoft.com/office/word/2010/wordprocessingGroup" xmlns:wpi="http://schemas.microsoft.com/office/word/2010/wordprocessingInk" xmlns:wne="http://schemas.microsoft.com/office/word/2006/wordml" xmlns:wps="http://schemas.microsoft.com/office/word/2010/wordprocessingShape" mc:Ignorable="w14 w15 w16se w16cid w16 w16cex w16sdtdh w16sdtfl w16du wp14">
   <w:p>
     <w:pPr>
       <w:pStyle w:val="Encabezado"/>
@@ -1798,7 +1737,7 @@
 </file>
 
 <file path=word/header2.xml><?xml version="1.0" encoding="utf-8"?>
-<w:hdr xmlns:wpc="http://schemas.microsoft.com/office/word/2010/wordprocessingCanvas" xmlns:cx="http://schemas.microsoft.com/office/drawing/2014/chartex" xmlns:mc="http://schemas.openxmlformats.org/markup-compatibility/2006" xmlns:o="urn:schemas-microsoft-com:office:office" xmlns:r="http://schemas.openxmlformats.org/officeDocument/2006/relationships" xmlns:m="http://schemas.openxmlformats.org/officeDocument/2006/math" xmlns:v="urn:schemas-microsoft-com:vml" xmlns:wp14="http://schemas.microsoft.com/office/word/2010/wordprocessingDrawing" xmlns:wp="http://schemas.openxmlformats.org/drawingml/2006/wordprocessingDrawing" xmlns:w10="urn:schemas-microsoft-com:office:word" xmlns:w="http://schemas.openxmlformats.org/wordprocessingml/2006/main" xmlns:w14="http://schemas.microsoft.com/office/word/2010/wordml" xmlns:w15="http://schemas.microsoft.com/office/word/2012/wordml" xmlns:w16se="http://schemas.microsoft.com/office/word/2015/wordml/symex" xmlns:wpg="http://schemas.microsoft.com/office/word/2010/wordprocessingGroup" xmlns:wpi="http://schemas.microsoft.com/office/word/2010/wordprocessingInk" xmlns:wne="http://schemas.microsoft.com/office/word/2006/wordml" xmlns:wps="http://schemas.microsoft.com/office/word/2010/wordprocessingShape" mc:Ignorable="w14 w15 w16se wp14">
+<w:hdr xmlns:wpc="http://schemas.microsoft.com/office/word/2010/wordprocessingCanvas" xmlns:cx="http://schemas.microsoft.com/office/drawing/2014/chartex" xmlns:cx1="http://schemas.microsoft.com/office/drawing/2015/9/8/chartex" xmlns:cx2="http://schemas.microsoft.com/office/drawing/2015/10/21/chartex" xmlns:cx3="http://schemas.microsoft.com/office/drawing/2016/5/9/chartex" xmlns:cx4="http://schemas.microsoft.com/office/drawing/2016/5/10/chartex" xmlns:cx5="http://schemas.microsoft.com/office/drawing/2016/5/11/chartex" xmlns:cx6="http://schemas.microsoft.com/office/drawing/2016/5/12/chartex" xmlns:cx7="http://schemas.microsoft.com/office/drawing/2016/5/13/chartex" xmlns:cx8="http://schemas.microsoft.com/office/drawing/2016/5/14/chartex" xmlns:mc="http://schemas.openxmlformats.org/markup-compatibility/2006" xmlns:aink="http://schemas.microsoft.com/office/drawing/2016/ink" xmlns:am3d="http://schemas.microsoft.com/office/drawing/2017/model3d" xmlns:o="urn:schemas-microsoft-com:office:office" xmlns:oel="http://schemas.microsoft.com/office/2019/extlst" xmlns:r="http://schemas.openxmlformats.org/officeDocument/2006/relationships" xmlns:m="http://schemas.openxmlformats.org/officeDocument/2006/math" xmlns:v="urn:schemas-microsoft-com:vml" xmlns:wp14="http://schemas.microsoft.com/office/word/2010/wordprocessingDrawing" xmlns:wp="http://schemas.openxmlformats.org/drawingml/2006/wordprocessingDrawing" xmlns:w10="urn:schemas-microsoft-com:office:word" xmlns:w="http://schemas.openxmlformats.org/wordprocessingml/2006/main" xmlns:w14="http://schemas.microsoft.com/office/word/2010/wordml" xmlns:w15="http://schemas.microsoft.com/office/word/2012/wordml" xmlns:w16cex="http://schemas.microsoft.com/office/word/2018/wordml/cex" xmlns:w16cid="http://schemas.microsoft.com/office/word/2016/wordml/cid" xmlns:w16="http://schemas.microsoft.com/office/word/2018/wordml" xmlns:w16du="http://schemas.microsoft.com/office/word/2023/wordml/word16du" xmlns:w16sdtdh="http://schemas.microsoft.com/office/word/2020/wordml/sdtdatahash" xmlns:w16sdtfl="http://schemas.microsoft.com/office/word/2024/wordml/sdtformatlock" xmlns:w16se="http://schemas.microsoft.com/office/word/2015/wordml/symex" xmlns:wpg="http://schemas.microsoft.com/office/word/2010/wordprocessingGroup" xmlns:wpi="http://schemas.microsoft.com/office/word/2010/wordprocessingInk" xmlns:wne="http://schemas.microsoft.com/office/word/2006/wordml" xmlns:wps="http://schemas.microsoft.com/office/word/2010/wordprocessingShape" mc:Ignorable="w14 w15 w16se w16cid w16 w16cex w16sdtdh w16sdtfl w16du wp14">
   <w:p>
     <w:pPr>
       <w:pStyle w:val="Encabezado"/>
@@ -1808,7 +1747,7 @@
 </file>
 
 <file path=word/header3.xml><?xml version="1.0" encoding="utf-8"?>
-<w:hdr xmlns:wpc="http://schemas.microsoft.com/office/word/2010/wordprocessingCanvas" xmlns:cx="http://schemas.microsoft.com/office/drawing/2014/chartex" xmlns:mc="http://schemas.openxmlformats.org/markup-compatibility/2006" xmlns:o="urn:schemas-microsoft-com:office:office" xmlns:r="http://schemas.openxmlformats.org/officeDocument/2006/relationships" xmlns:m="http://schemas.openxmlformats.org/officeDocument/2006/math" xmlns:v="urn:schemas-microsoft-com:vml" xmlns:wp14="http://schemas.microsoft.com/office/word/2010/wordprocessingDrawing" xmlns:wp="http://schemas.openxmlformats.org/drawingml/2006/wordprocessingDrawing" xmlns:w10="urn:schemas-microsoft-com:office:word" xmlns:w="http://schemas.openxmlformats.org/wordprocessingml/2006/main" xmlns:w14="http://schemas.microsoft.com/office/word/2010/wordml" xmlns:w15="http://schemas.microsoft.com/office/word/2012/wordml" xmlns:w16se="http://schemas.microsoft.com/office/word/2015/wordml/symex" xmlns:wpg="http://schemas.microsoft.com/office/word/2010/wordprocessingGroup" xmlns:wpi="http://schemas.microsoft.com/office/word/2010/wordprocessingInk" xmlns:wne="http://schemas.microsoft.com/office/word/2006/wordml" xmlns:wps="http://schemas.microsoft.com/office/word/2010/wordprocessingShape" mc:Ignorable="w14 w15 w16se wp14">
+<w:hdr xmlns:wpc="http://schemas.microsoft.com/office/word/2010/wordprocessingCanvas" xmlns:cx="http://schemas.microsoft.com/office/drawing/2014/chartex" xmlns:cx1="http://schemas.microsoft.com/office/drawing/2015/9/8/chartex" xmlns:cx2="http://schemas.microsoft.com/office/drawing/2015/10/21/chartex" xmlns:cx3="http://schemas.microsoft.com/office/drawing/2016/5/9/chartex" xmlns:cx4="http://schemas.microsoft.com/office/drawing/2016/5/10/chartex" xmlns:cx5="http://schemas.microsoft.com/office/drawing/2016/5/11/chartex" xmlns:cx6="http://schemas.microsoft.com/office/drawing/2016/5/12/chartex" xmlns:cx7="http://schemas.microsoft.com/office/drawing/2016/5/13/chartex" xmlns:cx8="http://schemas.microsoft.com/office/drawing/2016/5/14/chartex" xmlns:mc="http://schemas.openxmlformats.org/markup-compatibility/2006" xmlns:aink="http://schemas.microsoft.com/office/drawing/2016/ink" xmlns:am3d="http://schemas.microsoft.com/office/drawing/2017/model3d" xmlns:o="urn:schemas-microsoft-com:office:office" xmlns:oel="http://schemas.microsoft.com/office/2019/extlst" xmlns:r="http://schemas.openxmlformats.org/officeDocument/2006/relationships" xmlns:m="http://schemas.openxmlformats.org/officeDocument/2006/math" xmlns:v="urn:schemas-microsoft-com:vml" xmlns:wp14="http://schemas.microsoft.com/office/word/2010/wordprocessingDrawing" xmlns:wp="http://schemas.openxmlformats.org/drawingml/2006/wordprocessingDrawing" xmlns:w10="urn:schemas-microsoft-com:office:word" xmlns:w="http://schemas.openxmlformats.org/wordprocessingml/2006/main" xmlns:w14="http://schemas.microsoft.com/office/word/2010/wordml" xmlns:w15="http://schemas.microsoft.com/office/word/2012/wordml" xmlns:w16cex="http://schemas.microsoft.com/office/word/2018/wordml/cex" xmlns:w16cid="http://schemas.microsoft.com/office/word/2016/wordml/cid" xmlns:w16="http://schemas.microsoft.com/office/word/2018/wordml" xmlns:w16du="http://schemas.microsoft.com/office/word/2023/wordml/word16du" xmlns:w16sdtdh="http://schemas.microsoft.com/office/word/2020/wordml/sdtdatahash" xmlns:w16sdtfl="http://schemas.microsoft.com/office/word/2024/wordml/sdtformatlock" xmlns:w16se="http://schemas.microsoft.com/office/word/2015/wordml/symex" xmlns:wpg="http://schemas.microsoft.com/office/word/2010/wordprocessingGroup" xmlns:wpi="http://schemas.microsoft.com/office/word/2010/wordprocessingInk" xmlns:wne="http://schemas.microsoft.com/office/word/2006/wordml" xmlns:wps="http://schemas.microsoft.com/office/word/2010/wordprocessingShape" mc:Ignorable="w14 w15 w16se w16cid w16 w16cex w16sdtdh w16sdtfl w16du wp14">
   <w:p>
     <w:pPr>
       <w:pStyle w:val="Encabezado"/>
@@ -1818,7 +1757,7 @@
 </file>
 
 <file path=word/styles.xml><?xml version="1.0" encoding="utf-8"?>
-<w:styles xmlns:mc="http://schemas.openxmlformats.org/markup-compatibility/2006" xmlns:r="http://schemas.openxmlformats.org/officeDocument/2006/relationships" xmlns:w="http://schemas.openxmlformats.org/wordprocessingml/2006/main" xmlns:w14="http://schemas.microsoft.com/office/word/2010/wordml" xmlns:w15="http://schemas.microsoft.com/office/word/2012/wordml" xmlns:w16se="http://schemas.microsoft.com/office/word/2015/wordml/symex" mc:Ignorable="w14 w15 w16se">
+<w:styles xmlns:mc="http://schemas.openxmlformats.org/markup-compatibility/2006" xmlns:r="http://schemas.openxmlformats.org/officeDocument/2006/relationships" xmlns:w="http://schemas.openxmlformats.org/wordprocessingml/2006/main" xmlns:w14="http://schemas.microsoft.com/office/word/2010/wordml" xmlns:w15="http://schemas.microsoft.com/office/word/2012/wordml" xmlns:w16cex="http://schemas.microsoft.com/office/word/2018/wordml/cex" xmlns:w16cid="http://schemas.microsoft.com/office/word/2016/wordml/cid" xmlns:w16="http://schemas.microsoft.com/office/word/2018/wordml" xmlns:w16du="http://schemas.microsoft.com/office/word/2023/wordml/word16du" xmlns:w16sdtdh="http://schemas.microsoft.com/office/word/2020/wordml/sdtdatahash" xmlns:w16sdtfl="http://schemas.microsoft.com/office/word/2024/wordml/sdtformatlock" xmlns:w16se="http://schemas.microsoft.com/office/word/2015/wordml/symex" mc:Ignorable="w14 w15 w16se w16cid w16 w16cex w16sdtdh w16sdtfl w16du">
   <w:docDefaults>
     <w:rPrDefault>
       <w:rPr>
@@ -1834,7 +1773,7 @@
       </w:pPr>
     </w:pPrDefault>
   </w:docDefaults>
-  <w:latentStyles w:defLockedState="0" w:defUIPriority="99" w:defSemiHidden="0" w:defUnhideWhenUsed="0" w:defQFormat="0" w:count="371">
+  <w:latentStyles w:defLockedState="0" w:defUIPriority="99" w:defSemiHidden="0" w:defUnhideWhenUsed="0" w:defQFormat="0" w:count="376">
     <w:lsdException w:name="Normal" w:uiPriority="0" w:qFormat="1"/>
     <w:lsdException w:name="heading 1" w:uiPriority="0" w:qFormat="1"/>
     <w:lsdException w:name="heading 2" w:semiHidden="1" w:uiPriority="9" w:unhideWhenUsed="1" w:qFormat="1"/>
@@ -2206,6 +2145,11 @@
     <w:lsdException w:name="List Table 5 Dark Accent 6" w:uiPriority="50"/>
     <w:lsdException w:name="List Table 6 Colorful Accent 6" w:uiPriority="51"/>
     <w:lsdException w:name="List Table 7 Colorful Accent 6" w:uiPriority="52"/>
+    <w:lsdException w:name="Mention" w:semiHidden="1" w:unhideWhenUsed="1"/>
+    <w:lsdException w:name="Smart Hyperlink" w:semiHidden="1" w:unhideWhenUsed="1"/>
+    <w:lsdException w:name="Hashtag" w:semiHidden="1" w:unhideWhenUsed="1"/>
+    <w:lsdException w:name="Unresolved Mention" w:semiHidden="1" w:unhideWhenUsed="1"/>
+    <w:lsdException w:name="Smart Link" w:semiHidden="1" w:unhideWhenUsed="1"/>
   </w:latentStyles>
   <w:style w:type="paragraph" w:default="1" w:styleId="Normal">
     <w:name w:val="Normal"/>

</xml_diff>